<commit_message>
Update downloadable resume with portfolio link
</commit_message>
<xml_diff>
--- a/public/resume/高靖翔_AI产品经理_工具探索版.docx
+++ b/public/resume/高靖翔_AI产品经理_工具探索版.docx
@@ -41,6 +41,7 @@
                 <w:lang w:eastAsia="zh-CN"/>
               </w:rPr>
             </w:pPr>
+            <w:proofErr w:type="gramStart"/>
             <w:r>
               <w:rPr>
                 <w:rFonts w:cs="Noto Sans CJK SC"/>
@@ -50,6 +51,7 @@
               </w:rPr>
               <w:t>高靖翔</w:t>
             </w:r>
+            <w:proofErr w:type="gramEnd"/>
           </w:p>
           <w:p>
             <w:pPr>
@@ -106,9 +108,37 @@
             <w:r>
               <w:rPr>
                 <w:rFonts w:cs="Noto Sans CJK SC"/>
+                <w:u w:val="none"/>
               </w:rPr>
-              <w:t>LinkedIn：linkedin.com/in/靖翔-高-9b3b243b8</w:t>
+              <w:t>LinkedIn：</w:t>
             </w:r>
+            <w:hyperlink r:id="rId11">
+              <w:r>
+                <w:rPr>
+                  <w:rFonts w:cs="Noto Sans CJK SC"/>
+                  <w:color w:val="26785D"/>
+                  <w:u w:val="single"/>
+                </w:rPr>
+                <w:t>个人主页</w:t>
+              </w:r>
+            </w:hyperlink>
+            <w:r>
+              <w:rPr>
+                <w:rFonts w:cs="Noto Sans CJK SC"/>
+                <w:u w:val="none"/>
+              </w:rPr>
+              <w:t xml:space="preserve"> ｜ 作品集：</w:t>
+            </w:r>
+            <w:hyperlink r:id="rId12">
+              <w:r>
+                <w:rPr>
+                  <w:rFonts w:cs="Noto Sans CJK SC"/>
+                  <w:color w:val="26785D"/>
+                  <w:u w:val="single"/>
+                </w:rPr>
+                <w:t>valentintti.github.io</w:t>
+              </w:r>
+            </w:hyperlink>
           </w:p>
           <w:p>
             <w:pPr>
@@ -117,12 +147,21 @@
                 <w:lang w:eastAsia="zh-CN"/>
               </w:rPr>
             </w:pPr>
+            <w:proofErr w:type="gramStart"/>
             <w:r>
               <w:rPr>
                 <w:rFonts w:cs="Noto Sans CJK SC"/>
                 <w:lang w:eastAsia="zh-CN"/>
               </w:rPr>
-              <w:t>蒙纳士大学大数据科学硕士在读，关注 LLM 应用、AI Agent、智能客服、医疗信息整理</w:t>
+              <w:t>蒙纳士大学</w:t>
+            </w:r>
+            <w:proofErr w:type="gramEnd"/>
+            <w:r>
+              <w:rPr>
+                <w:rFonts w:cs="Noto Sans CJK SC"/>
+                <w:lang w:eastAsia="zh-CN"/>
+              </w:rPr>
+              <w:t>大数据科学硕士在读，关注 LLM 应用、AI Agent、智能客服、医疗信息整理</w:t>
             </w:r>
             <w:r>
               <w:rPr>
@@ -136,7 +175,23 @@
                 <w:rFonts w:cs="Noto Sans CJK SC"/>
                 <w:lang w:eastAsia="zh-CN"/>
               </w:rPr>
-              <w:t xml:space="preserve"> AI 工具工作流；能够从用户场景、产品边界、交互流程和可验证结果出发，设计可落地、可演示、可复盘的 AI 产品功能。</w:t>
+              <w:t xml:space="preserve"> AI 工具工作流；能够从用户场景、产品边界、交互流程和</w:t>
+            </w:r>
+            <w:proofErr w:type="gramStart"/>
+            <w:r>
+              <w:rPr>
+                <w:rFonts w:cs="Noto Sans CJK SC"/>
+                <w:lang w:eastAsia="zh-CN"/>
+              </w:rPr>
+              <w:t>可</w:t>
+            </w:r>
+            <w:proofErr w:type="gramEnd"/>
+            <w:r>
+              <w:rPr>
+                <w:rFonts w:cs="Noto Sans CJK SC"/>
+                <w:lang w:eastAsia="zh-CN"/>
+              </w:rPr>
+              <w:t>验证结果出发，设计可落地、可演示、可复盘的 AI 产品功能。</w:t>
             </w:r>
           </w:p>
         </w:tc>
@@ -213,6 +268,7 @@
         </w:pBdr>
         <w:spacing w:before="50" w:after="40" w:line="280" w:lineRule="exact"/>
       </w:pPr>
+      <w:proofErr w:type="spellStart"/>
       <w:r>
         <w:rPr>
           <w:rFonts w:cs="Noto Sans CJK SC"/>
@@ -221,6 +277,7 @@
         </w:rPr>
         <w:t>教育背景</w:t>
       </w:r>
+      <w:proofErr w:type="spellEnd"/>
     </w:p>
     <w:tbl>
       <w:tblPr>
@@ -547,13 +604,47 @@
             <w:pPr>
               <w:spacing w:after="0" w:line="268" w:lineRule="exact"/>
             </w:pPr>
+            <w:proofErr w:type="spellStart"/>
             <w:r>
               <w:rPr>
                 <w:rFonts w:cs="Noto Sans CJK SC"/>
                 <w:b/>
               </w:rPr>
-              <w:t>KnackCBD Ride｜AI 驱动的骑行安全决策支持平台</w:t>
+              <w:t>KnackCBD</w:t>
             </w:r>
+            <w:proofErr w:type="spellEnd"/>
+            <w:r>
+              <w:rPr>
+                <w:rFonts w:cs="Noto Sans CJK SC"/>
+                <w:b/>
+              </w:rPr>
+              <w:t xml:space="preserve"> </w:t>
+            </w:r>
+            <w:proofErr w:type="spellStart"/>
+            <w:r>
+              <w:rPr>
+                <w:rFonts w:cs="Noto Sans CJK SC"/>
+                <w:b/>
+              </w:rPr>
+              <w:t>Ride｜AI</w:t>
+            </w:r>
+            <w:proofErr w:type="spellEnd"/>
+            <w:r>
+              <w:rPr>
+                <w:rFonts w:cs="Noto Sans CJK SC"/>
+                <w:b/>
+              </w:rPr>
+              <w:t xml:space="preserve"> </w:t>
+            </w:r>
+            <w:proofErr w:type="spellStart"/>
+            <w:r>
+              <w:rPr>
+                <w:rFonts w:cs="Noto Sans CJK SC"/>
+                <w:b/>
+              </w:rPr>
+              <w:t>驱动的骑行安全决策支持平台</w:t>
+            </w:r>
+            <w:proofErr w:type="spellEnd"/>
           </w:p>
         </w:tc>
         <w:tc>
@@ -602,7 +693,55 @@
           <w:rFonts w:cs="Noto Sans CJK SC"/>
           <w:lang w:eastAsia="zh-CN"/>
         </w:rPr>
-        <w:t>参与设计并交付面向 Melbourne CBD 的智能骑行安全决策支持 Web 应用，围绕路线规划、路线安全比较、地图可视化、安全洞察、热门起终点分析和停车设施查询等场景，为用户提供更安全、可解释的出行决策支持。本人主要负责用户场景拆解、核心功能规划、数据指标到产品界面的转化，以及路线安全、地图图层和信息卡片的展示逻辑设计，配合团队完成前后端、地图和外部数据集成，体现用户场景理解、AI 决策支持产品设计和跨职能协作能力。</w:t>
+        <w:t>参与设计并交付面向 Melbourne CBD 的智能骑行</w:t>
+      </w:r>
+      <w:proofErr w:type="gramStart"/>
+      <w:r>
+        <w:rPr>
+          <w:rFonts w:cs="Noto Sans CJK SC"/>
+          <w:lang w:eastAsia="zh-CN"/>
+        </w:rPr>
+        <w:t>安全决策</w:t>
+      </w:r>
+      <w:proofErr w:type="gramEnd"/>
+      <w:r>
+        <w:rPr>
+          <w:rFonts w:cs="Noto Sans CJK SC"/>
+          <w:lang w:eastAsia="zh-CN"/>
+        </w:rPr>
+        <w:t>支持 Web 应用，围绕路线规划、路线安全比较、地图可视化、安全洞察、热门起终点分析和停车设施查询等场景，为用户提供更安全、可解释的出行决策支持。本人主要负责用户场景拆解、核心功能规划、数据指标到产品界面的转化，以及路线安全、地图</w:t>
+      </w:r>
+      <w:proofErr w:type="gramStart"/>
+      <w:r>
+        <w:rPr>
+          <w:rFonts w:cs="Noto Sans CJK SC"/>
+          <w:lang w:eastAsia="zh-CN"/>
+        </w:rPr>
+        <w:t>图</w:t>
+      </w:r>
+      <w:proofErr w:type="gramEnd"/>
+      <w:r>
+        <w:rPr>
+          <w:rFonts w:cs="Noto Sans CJK SC"/>
+          <w:lang w:eastAsia="zh-CN"/>
+        </w:rPr>
+        <w:t>层和信息卡片的展示逻辑设计，配合团队完成前后端、地图和外部数据集成，体现用户场景理解、AI 决策支持产品设计和</w:t>
+      </w:r>
+      <w:proofErr w:type="gramStart"/>
+      <w:r>
+        <w:rPr>
+          <w:rFonts w:cs="Noto Sans CJK SC"/>
+          <w:lang w:eastAsia="zh-CN"/>
+        </w:rPr>
+        <w:t>跨职能</w:t>
+      </w:r>
+      <w:proofErr w:type="gramEnd"/>
+      <w:r>
+        <w:rPr>
+          <w:rFonts w:cs="Noto Sans CJK SC"/>
+          <w:lang w:eastAsia="zh-CN"/>
+        </w:rPr>
+        <w:t>协作能力。</w:t>
       </w:r>
     </w:p>
     <w:tbl>
@@ -644,13 +783,23 @@
                 <w:lang w:eastAsia="zh-CN"/>
               </w:rPr>
             </w:pPr>
+            <w:proofErr w:type="gramStart"/>
             <w:r>
               <w:rPr>
                 <w:rFonts w:cs="Noto Sans CJK SC"/>
                 <w:b/>
                 <w:lang w:eastAsia="zh-CN"/>
               </w:rPr>
-              <w:t>查件小助｜物流 AI 客服 Agent Demo</w:t>
+              <w:t>查件小</w:t>
+            </w:r>
+            <w:proofErr w:type="gramEnd"/>
+            <w:r>
+              <w:rPr>
+                <w:rFonts w:cs="Noto Sans CJK SC"/>
+                <w:b/>
+                <w:lang w:eastAsia="zh-CN"/>
+              </w:rPr>
+              <w:t>助｜物流 AI 客服 Agent Demo</w:t>
             </w:r>
           </w:p>
         </w:tc>
@@ -728,7 +877,23 @@
           <w:rFonts w:cs="Noto Sans CJK SC"/>
           <w:lang w:eastAsia="zh-CN"/>
         </w:rPr>
-        <w:t>围绕“已发货但物流长时间未更新”的电商客服场景，交付本地端到端 AI Agent Demo，覆盖订单核验、轨迹查询、异常判断、确认催件、幂等 Mock 工单、人工转接、RAG 引用和脱敏 Trace。本人负责 V1 范围、PRD、状态机与 AI Harness 契约，通过严格 Schema、工具白名单、Acceptance Policy、一次性确认令牌和结果校验，防止模型越权改状态、编造 ETA 或伪造工单成功。</w:t>
+        <w:t>围绕“已发货但物流长时间未更新”的电商客服场景，交付本地端到端 AI Agent Demo，覆盖订单核验、轨迹查询、异常判断、确认催件、</w:t>
+      </w:r>
+      <w:proofErr w:type="gramStart"/>
+      <w:r>
+        <w:rPr>
+          <w:rFonts w:cs="Noto Sans CJK SC"/>
+          <w:lang w:eastAsia="zh-CN"/>
+        </w:rPr>
+        <w:t>幂</w:t>
+      </w:r>
+      <w:proofErr w:type="gramEnd"/>
+      <w:r>
+        <w:rPr>
+          <w:rFonts w:cs="Noto Sans CJK SC"/>
+          <w:lang w:eastAsia="zh-CN"/>
+        </w:rPr>
+        <w:t>等 Mock 工单、人工转接、RAG 引用和脱敏 Trace。本人负责 V1 范围、PRD、状态机与 AI Harness 契约，通过严格 Schema、工具白名单、Acceptance Policy、一次性确认令牌和结果校验，防止模型越权改状态、编造 ETA 或伪造工单成功。</w:t>
       </w:r>
     </w:p>
     <w:tbl>
@@ -770,13 +935,23 @@
                 <w:lang w:eastAsia="zh-CN"/>
               </w:rPr>
             </w:pPr>
+            <w:proofErr w:type="spellStart"/>
             <w:r>
               <w:rPr>
                 <w:rFonts w:cs="Noto Sans CJK SC"/>
                 <w:b/>
                 <w:lang w:eastAsia="zh-CN"/>
               </w:rPr>
-              <w:t>MedAsk｜医疗问诊信息整理助手</w:t>
+              <w:t>MedAsk</w:t>
+            </w:r>
+            <w:proofErr w:type="spellEnd"/>
+            <w:r>
+              <w:rPr>
+                <w:rFonts w:cs="Noto Sans CJK SC"/>
+                <w:b/>
+                <w:lang w:eastAsia="zh-CN"/>
+              </w:rPr>
+              <w:t>｜医疗问诊信息整理助手</w:t>
             </w:r>
           </w:p>
         </w:tc>
@@ -845,16 +1020,55 @@
       <w:pPr>
         <w:spacing w:after="44" w:line="268" w:lineRule="exact"/>
         <w:rPr>
-          <w:rFonts w:eastAsia="SimSun" w:cs="Noto Sans CJK SC"/>
+          <w:rFonts w:eastAsia="SimSun" w:cs="Noto Sans CJK SC" w:hint="eastAsia"/>
           <w:lang w:eastAsia="zh-CN"/>
         </w:rPr>
       </w:pPr>
       <w:r>
         <w:rPr>
+          <w:rFonts w:ascii="SimSun" w:eastAsia="SimSun" w:hAnsi="SimSun" w:cs="SimSun" w:hint="eastAsia"/>
+          <w:lang w:eastAsia="zh-CN"/>
+        </w:rPr>
+        <w:t>本人</w:t>
+      </w:r>
+      <w:r>
+        <w:rPr>
           <w:rFonts w:cs="Noto Sans CJK SC"/>
           <w:lang w:eastAsia="zh-CN"/>
         </w:rPr>
-        <w:t>将医疗问答收敛为 18-65 岁成人就医前症状信息整理，不做诊断或用药建议，而是在最多 7 轮内生成可编辑、可复制/打印的结构化摘要。基于患者侧文本完成数据治理、人工标注、主诉/当前性/意图标签和风险前置规则，设计规则版 MVP 与受控 LLM 槽位候选流程；模型不能控制状态、风险结论或最终摘要。项目建立 gold_v1/gold_v2、Schema Valid、Slot P/R、Evidence Grounding 和诊断/用药泄漏等评测门禁。</w:t>
+        <w:t>将医疗问答收敛为 18-65 岁成人就医</w:t>
+      </w:r>
+      <w:proofErr w:type="gramStart"/>
+      <w:r>
+        <w:rPr>
+          <w:rFonts w:cs="Noto Sans CJK SC"/>
+          <w:lang w:eastAsia="zh-CN"/>
+        </w:rPr>
+        <w:t>前症状</w:t>
+      </w:r>
+      <w:proofErr w:type="gramEnd"/>
+      <w:r>
+        <w:rPr>
+          <w:rFonts w:cs="Noto Sans CJK SC"/>
+          <w:lang w:eastAsia="zh-CN"/>
+        </w:rPr>
+        <w:t>信息整理，不做诊断或用药建议，而是在最多 7 轮内生成可编辑、可复制/打印的结构化摘要。基于患者侧文本完成数据治理、人工标注、主诉/当前性/意图标签和风险前置规则，设计</w:t>
+      </w:r>
+      <w:proofErr w:type="gramStart"/>
+      <w:r>
+        <w:rPr>
+          <w:rFonts w:cs="Noto Sans CJK SC"/>
+          <w:lang w:eastAsia="zh-CN"/>
+        </w:rPr>
+        <w:t>规则版</w:t>
+      </w:r>
+      <w:proofErr w:type="gramEnd"/>
+      <w:r>
+        <w:rPr>
+          <w:rFonts w:cs="Noto Sans CJK SC"/>
+          <w:lang w:eastAsia="zh-CN"/>
+        </w:rPr>
+        <w:t xml:space="preserve"> MVP 与受控 LLM 槽位候选流程；模型不能控制状态、风险结论或最终摘要。项目建立 gold_v1/gold_v2、Schema Valid、Slot P/R、Evidence Grounding 和诊断/用药泄漏等评测门禁。</w:t>
       </w:r>
     </w:p>
     <w:tbl>
@@ -987,7 +1201,21 @@
           <w:rFonts w:cs="Noto Sans CJK SC"/>
           <w:lang w:eastAsia="zh-CN"/>
         </w:rPr>
-        <w:t>基于 ChatGPT API 设计电影领域智能问答系统，支持电影查询、推荐、多轮对话和上下文理解；从用户提问、意图识别、推荐反馈和连续追问等场景设计对话流程。使用 Python 完成数据采集、清洗和对话逻辑构建，并结合知识图谱增强领域信息检索能力，探索 Prompt Design、上下文管理、错误兜底和 LLM 在垂直问答产品中的应用边界。</w:t>
+        <w:t>基于 ChatGPT API 设计电影领域智能问答系统，支持电影查询、推荐、多轮对话和上下文理解；从用户提问、意图识别、推荐反馈和连续追问等场景设计对话流程。</w:t>
+      </w:r>
+      <w:r>
+        <w:rPr>
+          <w:rFonts w:ascii="SimSun" w:eastAsia="SimSun" w:hAnsi="SimSun" w:cs="SimSun" w:hint="eastAsia"/>
+          <w:lang w:eastAsia="zh-CN"/>
+        </w:rPr>
+        <w:t>本人</w:t>
+      </w:r>
+      <w:r>
+        <w:rPr>
+          <w:rFonts w:cs="Noto Sans CJK SC"/>
+          <w:lang w:eastAsia="zh-CN"/>
+        </w:rPr>
+        <w:t>使用 Python 完成数据采集、清洗和对话逻辑构建，并结合知识图谱增强领域信息检索能力，探索 Prompt Design、上下文管理、错误兜底和 LLM 在垂直问答产品中的应用边界。</w:t>
       </w:r>
     </w:p>
     <w:p>
@@ -1017,7 +1245,135 @@
           <w:rFonts w:cs="Noto Sans CJK SC"/>
           <w:b/>
         </w:rPr>
-        <w:t>AI 产品能力：AI 场景分析、需求拆解、MVP 范围收敛、对话式 AI 产品、AI Agent、Function Calling、RAG、Prompt Design、状态机与 AI Harness 设计。</w:t>
+        <w:t xml:space="preserve">AI </w:t>
+      </w:r>
+      <w:proofErr w:type="spellStart"/>
+      <w:r>
+        <w:rPr>
+          <w:rFonts w:cs="Noto Sans CJK SC"/>
+          <w:b/>
+        </w:rPr>
+        <w:t>产品能力：AI</w:t>
+      </w:r>
+      <w:proofErr w:type="spellEnd"/>
+      <w:r>
+        <w:rPr>
+          <w:rFonts w:cs="Noto Sans CJK SC"/>
+          <w:b/>
+        </w:rPr>
+        <w:t xml:space="preserve"> </w:t>
+      </w:r>
+      <w:proofErr w:type="spellStart"/>
+      <w:r>
+        <w:rPr>
+          <w:rFonts w:cs="Noto Sans CJK SC"/>
+          <w:b/>
+        </w:rPr>
+        <w:t>场景分析、需求拆解、MVP</w:t>
+      </w:r>
+      <w:proofErr w:type="spellEnd"/>
+      <w:r>
+        <w:rPr>
+          <w:rFonts w:cs="Noto Sans CJK SC"/>
+          <w:b/>
+        </w:rPr>
+        <w:t xml:space="preserve"> </w:t>
+      </w:r>
+      <w:proofErr w:type="spellStart"/>
+      <w:r>
+        <w:rPr>
+          <w:rFonts w:cs="Noto Sans CJK SC"/>
+          <w:b/>
+        </w:rPr>
+        <w:t>范围收敛、对话式</w:t>
+      </w:r>
+      <w:proofErr w:type="spellEnd"/>
+      <w:r>
+        <w:rPr>
+          <w:rFonts w:cs="Noto Sans CJK SC"/>
+          <w:b/>
+        </w:rPr>
+        <w:t xml:space="preserve"> AI </w:t>
+      </w:r>
+      <w:proofErr w:type="spellStart"/>
+      <w:r>
+        <w:rPr>
+          <w:rFonts w:cs="Noto Sans CJK SC"/>
+          <w:b/>
+        </w:rPr>
+        <w:t>产品、AI</w:t>
+      </w:r>
+      <w:proofErr w:type="spellEnd"/>
+      <w:r>
+        <w:rPr>
+          <w:rFonts w:cs="Noto Sans CJK SC"/>
+          <w:b/>
+        </w:rPr>
+        <w:t xml:space="preserve"> </w:t>
+      </w:r>
+      <w:proofErr w:type="spellStart"/>
+      <w:r>
+        <w:rPr>
+          <w:rFonts w:cs="Noto Sans CJK SC"/>
+          <w:b/>
+        </w:rPr>
+        <w:t>Agent、Function</w:t>
+      </w:r>
+      <w:proofErr w:type="spellEnd"/>
+      <w:r>
+        <w:rPr>
+          <w:rFonts w:cs="Noto Sans CJK SC"/>
+          <w:b/>
+        </w:rPr>
+        <w:t xml:space="preserve"> </w:t>
+      </w:r>
+      <w:proofErr w:type="spellStart"/>
+      <w:r>
+        <w:rPr>
+          <w:rFonts w:cs="Noto Sans CJK SC"/>
+          <w:b/>
+        </w:rPr>
+        <w:t>Calling、RAG、Prompt</w:t>
+      </w:r>
+      <w:proofErr w:type="spellEnd"/>
+      <w:r>
+        <w:rPr>
+          <w:rFonts w:cs="Noto Sans CJK SC"/>
+          <w:b/>
+        </w:rPr>
+        <w:t xml:space="preserve"> </w:t>
+      </w:r>
+      <w:proofErr w:type="spellStart"/>
+      <w:r>
+        <w:rPr>
+          <w:rFonts w:cs="Noto Sans CJK SC"/>
+          <w:b/>
+        </w:rPr>
+        <w:t>Design、状态机与</w:t>
+      </w:r>
+      <w:proofErr w:type="spellEnd"/>
+      <w:r>
+        <w:rPr>
+          <w:rFonts w:cs="Noto Sans CJK SC"/>
+          <w:b/>
+        </w:rPr>
+        <w:t xml:space="preserve"> AI Harness </w:t>
+      </w:r>
+      <w:proofErr w:type="spellStart"/>
+      <w:r>
+        <w:rPr>
+          <w:rFonts w:cs="Noto Sans CJK SC"/>
+          <w:b/>
+        </w:rPr>
+        <w:t>设计</w:t>
+      </w:r>
+      <w:proofErr w:type="spellEnd"/>
+      <w:r>
+        <w:rPr>
+          <w:rFonts w:cs="Noto Sans CJK SC"/>
+          <w:b/>
+        </w:rPr>
+        <w:t>。</w:t>
       </w:r>
     </w:p>
     <w:p>
@@ -1033,7 +1389,43 @@
           <w:b/>
           <w:lang w:eastAsia="zh-CN"/>
         </w:rPr>
-        <w:t>AI 工具与平台：Codex、Coze、Claude Code、Cursor、WorkBuddy、Kimi、ChatGPT、DeepSeek；能快速试用新工具、比较适用场景，并沉淀到产品流程和 Demo 表达中。</w:t>
+        <w:t>AI 工具与平台：Codex、</w:t>
+      </w:r>
+      <w:proofErr w:type="spellStart"/>
+      <w:r>
+        <w:rPr>
+          <w:rFonts w:cs="Noto Sans CJK SC"/>
+          <w:b/>
+          <w:lang w:eastAsia="zh-CN"/>
+        </w:rPr>
+        <w:t>Coze</w:t>
+      </w:r>
+      <w:proofErr w:type="spellEnd"/>
+      <w:r>
+        <w:rPr>
+          <w:rFonts w:cs="Noto Sans CJK SC"/>
+          <w:b/>
+          <w:lang w:eastAsia="zh-CN"/>
+        </w:rPr>
+        <w:t>、Claude Code、Cursor、</w:t>
+      </w:r>
+      <w:proofErr w:type="spellStart"/>
+      <w:r>
+        <w:rPr>
+          <w:rFonts w:cs="Noto Sans CJK SC"/>
+          <w:b/>
+          <w:lang w:eastAsia="zh-CN"/>
+        </w:rPr>
+        <w:t>WorkBuddy</w:t>
+      </w:r>
+      <w:proofErr w:type="spellEnd"/>
+      <w:r>
+        <w:rPr>
+          <w:rFonts w:cs="Noto Sans CJK SC"/>
+          <w:b/>
+          <w:lang w:eastAsia="zh-CN"/>
+        </w:rPr>
+        <w:t>、Kimi、ChatGPT、DeepSeek；能快速试用新工具、比较适用场景，并沉淀到产品流程和 Demo 表达中。</w:t>
       </w:r>
     </w:p>
     <w:p>
@@ -1049,7 +1441,43 @@
           <w:b/>
           <w:lang w:eastAsia="zh-CN"/>
         </w:rPr>
-        <w:t>产品素质与协作：PRD 撰写、用户流程设计、竞品体验、Demo 演示脚本、跨职能沟通、快速学习、问题拆解和结果复盘。</w:t>
+        <w:t>产品素质与协作：PRD 撰写、用户流程设计、</w:t>
+      </w:r>
+      <w:proofErr w:type="gramStart"/>
+      <w:r>
+        <w:rPr>
+          <w:rFonts w:cs="Noto Sans CJK SC"/>
+          <w:b/>
+          <w:lang w:eastAsia="zh-CN"/>
+        </w:rPr>
+        <w:t>竞品体验</w:t>
+      </w:r>
+      <w:proofErr w:type="gramEnd"/>
+      <w:r>
+        <w:rPr>
+          <w:rFonts w:cs="Noto Sans CJK SC"/>
+          <w:b/>
+          <w:lang w:eastAsia="zh-CN"/>
+        </w:rPr>
+        <w:t>、Demo 演示脚本、</w:t>
+      </w:r>
+      <w:proofErr w:type="gramStart"/>
+      <w:r>
+        <w:rPr>
+          <w:rFonts w:cs="Noto Sans CJK SC"/>
+          <w:b/>
+          <w:lang w:eastAsia="zh-CN"/>
+        </w:rPr>
+        <w:t>跨职能沟通</w:t>
+      </w:r>
+      <w:proofErr w:type="gramEnd"/>
+      <w:r>
+        <w:rPr>
+          <w:rFonts w:cs="Noto Sans CJK SC"/>
+          <w:b/>
+          <w:lang w:eastAsia="zh-CN"/>
+        </w:rPr>
+        <w:t>、快速学习、问题拆解和结果复盘。</w:t>
       </w:r>
     </w:p>
     <w:p>

</xml_diff>